<commit_message>
Report: fix typos + remove 3 uncited references
- Typos: retuns->returns (§2), tiltig->tilting and whilest->whilst (§4).
- References: drop Baker & Wurgler (2007), Shapiro et al. (2022), and
  Tetlock (2007) - none cited in the body. Kept Hutto & Gilbert, Korab,
  Lopez de Prado, Loughran & McDonald.
- Add ai/self_assessment_2026-08-15.md (marker re-run).

Co-Authored-By: Claude Opus 4.8 <noreply@anthropic.com>
</commit_message>
<xml_diff>
--- a/report/Project_B_report_word.docx
+++ b/report/Project_B_report_word.docx
@@ -3002,11 +3002,7 @@
         <w:t xml:space="preserve">this resulted in it </w:t>
       </w:r>
       <w:r>
-        <w:t xml:space="preserve">being the </w:t>
-      </w:r>
-      <w:r/>
-      <w:r>
-        <w:t>second</w:t>
+        <w:t>being the second</w:t>
       </w:r>
       <w:r>
         <w:t xml:space="preserve">-best </w:t>
@@ -3078,7 +3074,7 @@
       </w:r>
       <w:proofErr w:type="spellStart"/>
       <w:r>
-        <w:t>retuns</w:t>
+        <w:t>returns</w:t>
       </w:r>
       <w:proofErr w:type="spellEnd"/>
       <w:r>
@@ -4657,7 +4653,7 @@
       </w:r>
       <w:proofErr w:type="spellStart"/>
       <w:r>
-        <w:t>tiltig</w:t>
+        <w:t>tilting</w:t>
       </w:r>
       <w:proofErr w:type="spellEnd"/>
       <w:r>
@@ -4665,7 +4661,7 @@
       </w:r>
       <w:proofErr w:type="spellStart"/>
       <w:r>
-        <w:t>whilest</w:t>
+        <w:t>whilst</w:t>
       </w:r>
       <w:proofErr w:type="spellEnd"/>
       <w:r>
@@ -5741,6 +5737,9 @@
       </w:r>
     </w:p>
     <w:p>
+      <w:r>
+        <w:t xml:space="preserve">  </w:t>
+      </w:r>
       <w:hyperlink r:id="rId15" w:history="1">
         <w:r>
           <w:rPr>
@@ -5909,11 +5908,11 @@
       </w:r>
       <w:proofErr w:type="spellEnd"/>
       <w:r>
-        <w:t xml:space="preserve"> remaining unrealistic assumption before any live deployment such as zero transaction costs. A live product should add a turnover-based cost model; the project brief itself treats a transaction-cost model as an innovation. Costs would bite hardest on the methods with the most re-balancing, Maximum </w:t>
+        <w:t xml:space="preserve"> remaining unrealistic assumption before any live deployment such as zero transaction costs. A live product should add a turnover-based cost model; the project brief itself treats a transaction-cost model as an </w:t>
       </w:r>
       <w:r>
         <w:lastRenderedPageBreak/>
-        <w:t>Sharpe above all, whose aggressive monthly reallocation is visible in Figure 3</w:t>
+        <w:t>innovation. Costs would bite hardest on the methods with the most re-balancing, Maximum Sharpe above all, whose aggressive monthly reallocation is visible in Figure 3</w:t>
       </w:r>
       <w:r>
         <w:t xml:space="preserve">. Therefore, the </w:t>
@@ -5965,7 +5964,7 @@
         <w:spacing w:after="160"/>
       </w:pPr>
       <w:r>
-        <w:t>Baker, M. and Wurgler, J. (2007). Investor Sentiment in the Stock Market. Journal of Economic Perspectives, 21(2), 129-151.</w:t>
+        <w:t>Hutto, C. J. and Gilbert, E. (2014). VADER: A Parsimonious Rule-based Model for Sentiment Analysis of Social Media Text. Proceedings of the Eighth International AAAI Conference on Weblogs and Social Media (ICWSM).</w:t>
       </w:r>
     </w:p>
     <w:p>
@@ -5973,7 +5972,23 @@
         <w:spacing w:after="160"/>
       </w:pPr>
       <w:r>
-        <w:t>Hutto, C. J. and Gilbert, E. (2014). VADER: A Parsimonious Rule-based Model for Sentiment Analysis of Social Media Text. Proceedings of the Eighth International AAAI Conference on Weblogs and Social Media (ICWSM).</w:t>
+        <w:t xml:space="preserve">Korab, P. (2023). </w:t>
+      </w:r>
+      <w:proofErr w:type="spellStart"/>
+      <w:r>
+        <w:t>finVADER</w:t>
+      </w:r>
+      <w:proofErr w:type="spellEnd"/>
+      <w:r>
+        <w:t xml:space="preserve">: financial sentiment analysis with VADER, </w:t>
+      </w:r>
+      <w:proofErr w:type="spellStart"/>
+      <w:r>
+        <w:t>SentiBigNomics</w:t>
+      </w:r>
+      <w:proofErr w:type="spellEnd"/>
+      <w:r>
+        <w:t xml:space="preserve"> and the Henry lexicon (Python package).</w:t>
       </w:r>
     </w:p>
     <w:p>
@@ -5981,23 +5996,7 @@
         <w:spacing w:after="160"/>
       </w:pPr>
       <w:r>
-        <w:t xml:space="preserve">Korab, P. (2023). </w:t>
-      </w:r>
-      <w:proofErr w:type="spellStart"/>
-      <w:r>
-        <w:t>finVADER</w:t>
-      </w:r>
-      <w:proofErr w:type="spellEnd"/>
-      <w:r>
-        <w:t xml:space="preserve">: financial sentiment analysis with VADER, </w:t>
-      </w:r>
-      <w:proofErr w:type="spellStart"/>
-      <w:r>
-        <w:t>SentiBigNomics</w:t>
-      </w:r>
-      <w:proofErr w:type="spellEnd"/>
-      <w:r>
-        <w:t xml:space="preserve"> and the Henry lexicon (Python package).</w:t>
+        <w:t>Lopez de Prado, M. (2016). Building Diversified Portfolios that Outperform Out-of-Sample. The Journal of Portfolio Management, 42(4), 59-69.</w:t>
       </w:r>
     </w:p>
     <w:p>
@@ -6005,39 +6004,7 @@
         <w:spacing w:after="160"/>
       </w:pPr>
       <w:r>
-        <w:t>Lopez de Prado, M. (2016). Building Diversified Portfolios that Outperform Out-of-Sample. The Journal of Portfolio Management, 42(4), 59-69.</w:t>
-      </w:r>
-    </w:p>
-    <w:p>
-      <w:pPr>
-        <w:spacing w:after="160"/>
-      </w:pPr>
-      <w:r>
         <w:t>Loughran, T. and McDonald, B. (2011). When Is a Liability Not a Liability? Textual Analysis, Dictionaries, and 10-Ks. Journal of Finance, 66(1), 35-65.</w:t>
-      </w:r>
-    </w:p>
-    <w:p>
-      <w:pPr>
-        <w:spacing w:after="160"/>
-      </w:pPr>
-      <w:r>
-        <w:t xml:space="preserve">Shapiro, A. H., </w:t>
-      </w:r>
-      <w:proofErr w:type="spellStart"/>
-      <w:r>
-        <w:t>Sudhof</w:t>
-      </w:r>
-      <w:proofErr w:type="spellEnd"/>
-      <w:r>
-        <w:t>, M. and Wilson, D. J. (2022). Measuring news sentiment. Journal of Econometrics, 228(2), 221-243.</w:t>
-      </w:r>
-    </w:p>
-    <w:p>
-      <w:pPr>
-        <w:spacing w:after="160"/>
-      </w:pPr>
-      <w:r>
-        <w:t>Tetlock, P. C. (2007). Giving Content to Investor Sentiment: The Role of Media in the Stock Market. Journal of Finance, 62(3), 1139-1168.</w:t>
       </w:r>
     </w:p>
     <w:p>
@@ -18563,6 +18530,18 @@
       <w:shd w:val="clear" w:color="auto" w:fill="E1DFDD"/>
     </w:rPr>
   </w:style>
+  <w:style w:type="character" w:styleId="FollowedHyperlink">
+    <w:name w:val="FollowedHyperlink"/>
+    <w:basedOn w:val="DefaultParagraphFont"/>
+    <w:uiPriority w:val="99"/>
+    <w:semiHidden/>
+    <w:unhideWhenUsed/>
+    <w:rsid w:val="002D53C4"/>
+    <w:rPr>
+      <w:color w:val="800080" w:themeColor="followedHyperlink"/>
+      <w:u w:val="single"/>
+    </w:rPr>
+  </w:style>
 </w:styles>
 </file>
 

</xml_diff>

<commit_message>
Figure 1: replace per-panel legends with one shared legend below panels
The crypto panel's legend was overlapping the lines. Colour = method is
identical across all three panels, so a single shared legend beneath them
removes the obstruction (and declutters equity/combined too). Regenerated
cumret_by_family.png and swapped it into the docx, adjusting the picture
height for the new aspect. PDF still needs re-exporting from the docx.

Co-Authored-By: Claude Opus 4.8 <noreply@anthropic.com>
</commit_message>
<xml_diff>
--- a/report/Project_B_report_word.docx
+++ b/report/Project_B_report_word.docx
@@ -3173,7 +3173,7 @@
         </w:rPr>
         <w:drawing>
           <wp:inline distT="0" distB="0" distL="0" distR="0" wp14:anchorId="655CD705" wp14:editId="35B1CFEE">
-            <wp:extent cx="5733288" cy="2023189"/>
+            <wp:extent cx="5733288" cy="2225638"/>
             <wp:effectExtent l="0" t="0" r="0" b="0"/>
             <wp:docPr id="1" name="Picture 1"/>
             <wp:cNvGraphicFramePr>
@@ -3195,7 +3195,7 @@
                   <pic:spPr>
                     <a:xfrm>
                       <a:off x="0" y="0"/>
-                      <a:ext cx="5733288" cy="2023189"/>
+                      <a:ext cx="5733288" cy="2225638"/>
                     </a:xfrm>
                     <a:prstGeom prst="rect">
                       <a:avLst/>

</xml_diff>

<commit_message>
Report: add in-text cross-references for all figures
Every figure (1-7) is now referenced in-text. Pointers "(Figure X)"
were inserted into the existing topically-matching sentences (no new
interpretation added); Figure 3 was already referenced. Closes the
Criterion 5 "every exhibit interpreted" gap.

Co-Authored-By: Claude Opus 4.8 <noreply@anthropic.com>
</commit_message>
<xml_diff>
--- a/report/Project_B_report_word.docx
+++ b/report/Project_B_report_word.docx
@@ -2769,7 +2769,7 @@
       </w:r>
       <w:proofErr w:type="spellEnd"/>
       <w:r>
-        <w:t xml:space="preserve"> return. </w:t>
+        <w:t xml:space="preserve"> return (Figure 4). </w:t>
       </w:r>
       <w:r>
         <w:t>This</w:t>
@@ -2854,7 +2854,7 @@
         <w:spacing w:after="160"/>
       </w:pPr>
       <w:r>
-        <w:t>However, the Crypto Max Sharpe is the worst performing of all five crypto funds, with a Sharpe ratio of 0.229 and a maximum drawdown of -89.5%, despite crypto being the highest-returning class in the sample, caused by the method’s reliance on the sample mean return. Because Crypto returns are extremely volatile and fat-tailed, a single 252-day estimate of the mean is dominated by noise. Maximum Sharpe then concentrates portfolio weighting in the coin which spiked in the window,</w:t>
+        <w:t>However, the Crypto Max Sharpe is the worst performing of all five crypto funds, with a Sharpe ratio of 0.229 and a maximum drawdown of -89.5%, despite crypto being the highest-returning class in the sample (Figure 1), caused by the method’s reliance on the sample mean return. Because Crypto returns are extremely volatile and fat-tailed, a single 252-day estimate of the mean is dominated by noise. Maximum Sharpe then concentrates portfolio weighting in the coin which spiked in the window,</w:t>
       </w:r>
       <w:r>
         <w:t xml:space="preserve"> </w:t>
@@ -3011,7 +3011,7 @@
         <w:t xml:space="preserve">in all </w:t>
       </w:r>
       <w:r>
-        <w:t>five methods. HRP</w:t>
+        <w:t>five methods (Figure 2). HRP</w:t>
       </w:r>
       <w:r>
         <w:t xml:space="preserve"> offers</w:t>
@@ -3787,7 +3787,7 @@
         <w:t xml:space="preserve">fund-facing </w:t>
       </w:r>
       <w:r>
-        <w:t>model takes an equal-weighted average across the sector's stocks, so one heavily covered mega-cap cannot dominate the sector's mood. Th</w:t>
+        <w:t>model takes an equal-weighted average across the sector's stocks, so one heavily covered mega-cap cannot dominate the sector's mood (Figure 6). Th</w:t>
       </w:r>
       <w:r>
         <w:t>is data</w:t>
@@ -4038,7 +4038,7 @@
         <w:t>st also</w:t>
       </w:r>
       <w:r>
-        <w:t xml:space="preserve"> remaining valid for a live signal. The latest reading is extreme greed, a z-score of about 2.25, meaning the market sits 2.25 standard deviations above its own 2020 to 2023 average, a window </w:t>
+        <w:t xml:space="preserve"> remaining valid for a live signal. The latest reading is extreme greed (Figure 5), a z-score of about 2.25, meaning the market sits 2.25 standard deviations above its own 2020 to 2023 average, a window </w:t>
       </w:r>
       <w:r>
         <w:t>which includes the black-swan events of COVID and the 2022 selloff.</w:t>
@@ -4657,7 +4657,7 @@
       </w:r>
       <w:proofErr w:type="spellEnd"/>
       <w:r>
-        <w:t xml:space="preserve"> into the equity Max Sharpe fund improved its risk-adjusted return but worsened the max drawdown. The fund without sentiment tilting returned 11.97% with a Sharpe ratio of 0.534, and a max drawdown of -26.10%. Tilting its weights toward the sectors with above-median lagged sentiment increased the return to 12.32% and the Sharpe up to 0.552, which is a gain of 0.018, </w:t>
+        <w:t xml:space="preserve"> into the equity Max Sharpe fund improved its risk-adjusted return but worsened the max drawdown (Figure 7). The fund without sentiment tilting returned 11.97% with a Sharpe ratio of 0.534, and a max drawdown of -26.10%. Tilting its weights toward the sectors with above-median lagged sentiment increased the return to 12.32% and the Sharpe up to 0.552, which is a gain of 0.018, </w:t>
       </w:r>
       <w:proofErr w:type="spellStart"/>
       <w:r>

</xml_diff>